<commit_message>
style(docx): remove all emojis and icons for formal corporate executive aesthetic
</commit_message>
<xml_diff>
--- a/ISML_LMS_COMPLETE_ERD_DOCUMENTATION.docx
+++ b/ISML_LMS_COMPLETE_ERD_DOCUMENTATION.docx
@@ -280,7 +280,7 @@
           <w:color w:val="0B2447"/>
           <w:sz w:val="34"/>
         </w:rPr>
-        <w:t>1. Comprehensive Executive Summary &amp; Business Guide</w:t>
+        <w:t>1. Executive Summary &amp; Business Guide (For Management)</w:t>
       </w:r>
     </w:p>
     <w:p>
@@ -300,7 +300,7 @@
           <w:color w:val="1E3A8A"/>
           <w:sz w:val="29"/>
         </w:rPr>
-        <w:t>💡 What is ISML LMS?</w:t>
+        <w:t>What is ISML LMS?</w:t>
       </w:r>
     </w:p>
     <w:p>
@@ -359,7 +359,7 @@
                 <w:color w:val="0B2447"/>
                 <w:sz w:val="23"/>
               </w:rPr>
-              <w:t>📊 VISUAL ARCHITECTURE OVERVIEW — SHARED WEBINAR BATCH PATTERN</w:t>
+              <w:t>SYSTEM ARCHITECTURE OVERVIEW — SHARED WEBINAR BATCH PATTERN</w:t>
               <w:br/>
             </w:r>
             <w:r>
@@ -398,7 +398,7 @@
           <w:color w:val="1E3A8A"/>
           <w:sz w:val="29"/>
         </w:rPr>
-        <w:t>🔑 The 5 Core Principles Every Executive Must Understand:</w:t>
+        <w:t>The 5 Core Architectural Principles:</w:t>
       </w:r>
     </w:p>
     <w:p>
@@ -1231,7 +1231,7 @@
                 <w:color w:val="0B2447"/>
                 <w:sz w:val="23"/>
               </w:rPr>
-              <w:t>🗺️ MASTER SYSTEM ARCHITECTURE TREE</w:t>
+              <w:t>MASTER SYSTEM ARCHITECTURE TREE</w:t>
               <w:br/>
             </w:r>
             <w:r>
@@ -1330,7 +1330,7 @@
           <w:color w:val="0B2447"/>
           <w:sz w:val="24"/>
         </w:rPr>
-        <w:t xml:space="preserve">📋 Executive Story &amp; Purpose: </w:t>
+        <w:t xml:space="preserve">Executive Story &amp; Purpose: </w:t>
       </w:r>
       <w:r>
         <w:rPr>
@@ -1351,7 +1351,7 @@
           <w:color w:val="1E3A8A"/>
           <w:sz w:val="24"/>
         </w:rPr>
-        <w:t xml:space="preserve">⚙️ Operational Mechanics &amp; Business Value: </w:t>
+        <w:t xml:space="preserve">Operational Mechanics &amp; Business Value: </w:t>
       </w:r>
       <w:r>
         <w:rPr>
@@ -1372,7 +1372,7 @@
           <w:color w:val="1E3A8A"/>
           <w:sz w:val="23"/>
         </w:rPr>
-        <w:t>🧩 Underpinning Database Models:</w:t>
+        <w:t>Underpinning Database Models:</w:t>
       </w:r>
     </w:p>
     <w:p>
@@ -1589,7 +1589,7 @@
                 <w:color w:val="0B2447"/>
                 <w:sz w:val="23"/>
               </w:rPr>
-              <w:t>🔄 CARDINALITY &amp; RELATIONSHIP FLOW — Domain 01</w:t>
+              <w:t>CARDINALITY &amp; RELATIONSHIP FLOW — Domain 01</w:t>
               <w:br/>
             </w:r>
             <w:r>
@@ -1648,7 +1648,7 @@
           <w:color w:val="0B2447"/>
           <w:sz w:val="24"/>
         </w:rPr>
-        <w:t xml:space="preserve">📋 Executive Story &amp; Purpose: </w:t>
+        <w:t xml:space="preserve">Executive Story &amp; Purpose: </w:t>
       </w:r>
       <w:r>
         <w:rPr>
@@ -1669,7 +1669,7 @@
           <w:color w:val="1E3A8A"/>
           <w:sz w:val="24"/>
         </w:rPr>
-        <w:t xml:space="preserve">⚙️ Operational Mechanics &amp; Business Value: </w:t>
+        <w:t xml:space="preserve">Operational Mechanics &amp; Business Value: </w:t>
       </w:r>
       <w:r>
         <w:rPr>
@@ -1690,7 +1690,7 @@
           <w:color w:val="1E3A8A"/>
           <w:sz w:val="23"/>
         </w:rPr>
-        <w:t>🧩 Underpinning Database Models:</w:t>
+        <w:t>Underpinning Database Models:</w:t>
       </w:r>
     </w:p>
     <w:p>
@@ -1928,7 +1928,7 @@
                 <w:color w:val="0B2447"/>
                 <w:sz w:val="23"/>
               </w:rPr>
-              <w:t>🔄 CARDINALITY &amp; RELATIONSHIP FLOW — Domain 02</w:t>
+              <w:t>CARDINALITY &amp; RELATIONSHIP FLOW — Domain 02</w:t>
               <w:br/>
             </w:r>
             <w:r>
@@ -1985,7 +1985,7 @@
           <w:color w:val="0B2447"/>
           <w:sz w:val="24"/>
         </w:rPr>
-        <w:t xml:space="preserve">📋 Executive Story &amp; Purpose: </w:t>
+        <w:t xml:space="preserve">Executive Story &amp; Purpose: </w:t>
       </w:r>
       <w:r>
         <w:rPr>
@@ -2006,7 +2006,7 @@
           <w:color w:val="1E3A8A"/>
           <w:sz w:val="24"/>
         </w:rPr>
-        <w:t xml:space="preserve">⚙️ Operational Mechanics &amp; Business Value: </w:t>
+        <w:t xml:space="preserve">Operational Mechanics &amp; Business Value: </w:t>
       </w:r>
       <w:r>
         <w:rPr>
@@ -2027,7 +2027,7 @@
           <w:color w:val="1E3A8A"/>
           <w:sz w:val="23"/>
         </w:rPr>
-        <w:t>🧩 Underpinning Database Models:</w:t>
+        <w:t>Underpinning Database Models:</w:t>
       </w:r>
     </w:p>
     <w:p>
@@ -2223,7 +2223,7 @@
                 <w:color w:val="0B2447"/>
                 <w:sz w:val="23"/>
               </w:rPr>
-              <w:t>🔄 CARDINALITY &amp; RELATIONSHIP FLOW — Domain 03</w:t>
+              <w:t>CARDINALITY &amp; RELATIONSHIP FLOW — Domain 03</w:t>
               <w:br/>
             </w:r>
             <w:r>
@@ -2280,7 +2280,7 @@
           <w:color w:val="0B2447"/>
           <w:sz w:val="24"/>
         </w:rPr>
-        <w:t xml:space="preserve">📋 Executive Story &amp; Purpose: </w:t>
+        <w:t xml:space="preserve">Executive Story &amp; Purpose: </w:t>
       </w:r>
       <w:r>
         <w:rPr>
@@ -2301,7 +2301,7 @@
           <w:color w:val="1E3A8A"/>
           <w:sz w:val="24"/>
         </w:rPr>
-        <w:t xml:space="preserve">⚙️ Operational Mechanics &amp; Business Value: </w:t>
+        <w:t xml:space="preserve">Operational Mechanics &amp; Business Value: </w:t>
       </w:r>
       <w:r>
         <w:rPr>
@@ -2322,7 +2322,7 @@
           <w:color w:val="1E3A8A"/>
           <w:sz w:val="23"/>
         </w:rPr>
-        <w:t>🧩 Underpinning Database Models:</w:t>
+        <w:t>Underpinning Database Models:</w:t>
       </w:r>
     </w:p>
     <w:p>
@@ -2476,7 +2476,7 @@
                 <w:color w:val="0B2447"/>
                 <w:sz w:val="23"/>
               </w:rPr>
-              <w:t>🔄 CARDINALITY &amp; RELATIONSHIP FLOW — Domain 04</w:t>
+              <w:t>CARDINALITY &amp; RELATIONSHIP FLOW — Domain 04</w:t>
               <w:br/>
             </w:r>
             <w:r>
@@ -2533,7 +2533,7 @@
           <w:color w:val="0B2447"/>
           <w:sz w:val="24"/>
         </w:rPr>
-        <w:t xml:space="preserve">📋 Executive Story &amp; Purpose: </w:t>
+        <w:t xml:space="preserve">Executive Story &amp; Purpose: </w:t>
       </w:r>
       <w:r>
         <w:rPr>
@@ -2554,7 +2554,7 @@
           <w:color w:val="1E3A8A"/>
           <w:sz w:val="24"/>
         </w:rPr>
-        <w:t xml:space="preserve">⚙️ Operational Mechanics &amp; Business Value: </w:t>
+        <w:t xml:space="preserve">Operational Mechanics &amp; Business Value: </w:t>
       </w:r>
       <w:r>
         <w:rPr>
@@ -2575,7 +2575,7 @@
           <w:color w:val="1E3A8A"/>
           <w:sz w:val="23"/>
         </w:rPr>
-        <w:t>🧩 Underpinning Database Models:</w:t>
+        <w:t>Underpinning Database Models:</w:t>
       </w:r>
     </w:p>
     <w:p>
@@ -2708,7 +2708,7 @@
                 <w:color w:val="0B2447"/>
                 <w:sz w:val="23"/>
               </w:rPr>
-              <w:t>🔄 CARDINALITY &amp; RELATIONSHIP FLOW — Domain 05</w:t>
+              <w:t>CARDINALITY &amp; RELATIONSHIP FLOW — Domain 05</w:t>
               <w:br/>
             </w:r>
             <w:r>
@@ -2765,7 +2765,7 @@
           <w:color w:val="0B2447"/>
           <w:sz w:val="24"/>
         </w:rPr>
-        <w:t xml:space="preserve">📋 Executive Story &amp; Purpose: </w:t>
+        <w:t xml:space="preserve">Executive Story &amp; Purpose: </w:t>
       </w:r>
       <w:r>
         <w:rPr>
@@ -2786,7 +2786,7 @@
           <w:color w:val="1E3A8A"/>
           <w:sz w:val="24"/>
         </w:rPr>
-        <w:t xml:space="preserve">⚙️ Operational Mechanics &amp; Business Value: </w:t>
+        <w:t xml:space="preserve">Operational Mechanics &amp; Business Value: </w:t>
       </w:r>
       <w:r>
         <w:rPr>
@@ -2807,7 +2807,7 @@
           <w:color w:val="1E3A8A"/>
           <w:sz w:val="23"/>
         </w:rPr>
-        <w:t>🧩 Underpinning Database Models:</w:t>
+        <w:t>Underpinning Database Models:</w:t>
       </w:r>
     </w:p>
     <w:p>
@@ -3024,7 +3024,7 @@
                 <w:color w:val="0B2447"/>
                 <w:sz w:val="23"/>
               </w:rPr>
-              <w:t>🔄 CARDINALITY &amp; RELATIONSHIP FLOW — Domain 06</w:t>
+              <w:t>CARDINALITY &amp; RELATIONSHIP FLOW — Domain 06</w:t>
               <w:br/>
             </w:r>
             <w:r>
@@ -3079,7 +3079,7 @@
           <w:color w:val="0B2447"/>
           <w:sz w:val="24"/>
         </w:rPr>
-        <w:t xml:space="preserve">📋 Executive Story &amp; Purpose: </w:t>
+        <w:t xml:space="preserve">Executive Story &amp; Purpose: </w:t>
       </w:r>
       <w:r>
         <w:rPr>
@@ -3100,7 +3100,7 @@
           <w:color w:val="1E3A8A"/>
           <w:sz w:val="24"/>
         </w:rPr>
-        <w:t xml:space="preserve">⚙️ Operational Mechanics &amp; Business Value: </w:t>
+        <w:t xml:space="preserve">Operational Mechanics &amp; Business Value: </w:t>
       </w:r>
       <w:r>
         <w:rPr>
@@ -3121,7 +3121,7 @@
           <w:color w:val="1E3A8A"/>
           <w:sz w:val="23"/>
         </w:rPr>
-        <w:t>🧩 Underpinning Database Models:</w:t>
+        <w:t>Underpinning Database Models:</w:t>
       </w:r>
     </w:p>
     <w:p>
@@ -3254,7 +3254,7 @@
                 <w:color w:val="0B2447"/>
                 <w:sz w:val="23"/>
               </w:rPr>
-              <w:t>🔄 CARDINALITY &amp; RELATIONSHIP FLOW — Domain 07</w:t>
+              <w:t>CARDINALITY &amp; RELATIONSHIP FLOW — Domain 07</w:t>
               <w:br/>
             </w:r>
             <w:r>
@@ -3309,7 +3309,7 @@
           <w:color w:val="0B2447"/>
           <w:sz w:val="24"/>
         </w:rPr>
-        <w:t xml:space="preserve">📋 Executive Story &amp; Purpose: </w:t>
+        <w:t xml:space="preserve">Executive Story &amp; Purpose: </w:t>
       </w:r>
       <w:r>
         <w:rPr>
@@ -3330,7 +3330,7 @@
           <w:color w:val="1E3A8A"/>
           <w:sz w:val="24"/>
         </w:rPr>
-        <w:t xml:space="preserve">⚙️ Operational Mechanics &amp; Business Value: </w:t>
+        <w:t xml:space="preserve">Operational Mechanics &amp; Business Value: </w:t>
       </w:r>
       <w:r>
         <w:rPr>
@@ -3351,7 +3351,7 @@
           <w:color w:val="1E3A8A"/>
           <w:sz w:val="23"/>
         </w:rPr>
-        <w:t>🧩 Underpinning Database Models:</w:t>
+        <w:t>Underpinning Database Models:</w:t>
       </w:r>
     </w:p>
     <w:p>
@@ -3463,7 +3463,7 @@
                 <w:color w:val="0B2447"/>
                 <w:sz w:val="23"/>
               </w:rPr>
-              <w:t>🔄 CARDINALITY &amp; RELATIONSHIP FLOW — Domain 08</w:t>
+              <w:t>CARDINALITY &amp; RELATIONSHIP FLOW — Domain 08</w:t>
               <w:br/>
             </w:r>
             <w:r>
@@ -3520,7 +3520,7 @@
           <w:color w:val="0B2447"/>
           <w:sz w:val="24"/>
         </w:rPr>
-        <w:t xml:space="preserve">📋 Executive Story &amp; Purpose: </w:t>
+        <w:t xml:space="preserve">Executive Story &amp; Purpose: </w:t>
       </w:r>
       <w:r>
         <w:rPr>
@@ -3541,7 +3541,7 @@
           <w:color w:val="1E3A8A"/>
           <w:sz w:val="24"/>
         </w:rPr>
-        <w:t xml:space="preserve">⚙️ Operational Mechanics &amp; Business Value: </w:t>
+        <w:t xml:space="preserve">Operational Mechanics &amp; Business Value: </w:t>
       </w:r>
       <w:r>
         <w:rPr>
@@ -3562,7 +3562,7 @@
           <w:color w:val="1E3A8A"/>
           <w:sz w:val="23"/>
         </w:rPr>
-        <w:t>🧩 Underpinning Database Models:</w:t>
+        <w:t>Underpinning Database Models:</w:t>
       </w:r>
     </w:p>
     <w:p>
@@ -3737,7 +3737,7 @@
                 <w:color w:val="0B2447"/>
                 <w:sz w:val="23"/>
               </w:rPr>
-              <w:t>🔄 CARDINALITY &amp; RELATIONSHIP FLOW — Domain 09</w:t>
+              <w:t>CARDINALITY &amp; RELATIONSHIP FLOW — Domain 09</w:t>
               <w:br/>
             </w:r>
             <w:r>
@@ -3792,7 +3792,7 @@
           <w:color w:val="0B2447"/>
           <w:sz w:val="24"/>
         </w:rPr>
-        <w:t xml:space="preserve">📋 Executive Story &amp; Purpose: </w:t>
+        <w:t xml:space="preserve">Executive Story &amp; Purpose: </w:t>
       </w:r>
       <w:r>
         <w:rPr>
@@ -3813,7 +3813,7 @@
           <w:color w:val="1E3A8A"/>
           <w:sz w:val="24"/>
         </w:rPr>
-        <w:t xml:space="preserve">⚙️ Operational Mechanics &amp; Business Value: </w:t>
+        <w:t xml:space="preserve">Operational Mechanics &amp; Business Value: </w:t>
       </w:r>
       <w:r>
         <w:rPr>
@@ -3834,7 +3834,7 @@
           <w:color w:val="1E3A8A"/>
           <w:sz w:val="23"/>
         </w:rPr>
-        <w:t>🧩 Underpinning Database Models:</w:t>
+        <w:t>Underpinning Database Models:</w:t>
       </w:r>
     </w:p>
     <w:p>
@@ -4009,7 +4009,7 @@
                 <w:color w:val="0B2447"/>
                 <w:sz w:val="23"/>
               </w:rPr>
-              <w:t>🔄 CARDINALITY &amp; RELATIONSHIP FLOW — Domain 10</w:t>
+              <w:t>CARDINALITY &amp; RELATIONSHIP FLOW — Domain 10</w:t>
               <w:br/>
             </w:r>
             <w:r>
@@ -4064,7 +4064,7 @@
           <w:color w:val="0B2447"/>
           <w:sz w:val="24"/>
         </w:rPr>
-        <w:t xml:space="preserve">📋 Executive Story &amp; Purpose: </w:t>
+        <w:t xml:space="preserve">Executive Story &amp; Purpose: </w:t>
       </w:r>
       <w:r>
         <w:rPr>
@@ -4085,7 +4085,7 @@
           <w:color w:val="1E3A8A"/>
           <w:sz w:val="24"/>
         </w:rPr>
-        <w:t xml:space="preserve">⚙️ Operational Mechanics &amp; Business Value: </w:t>
+        <w:t xml:space="preserve">Operational Mechanics &amp; Business Value: </w:t>
       </w:r>
       <w:r>
         <w:rPr>
@@ -4106,7 +4106,7 @@
           <w:color w:val="1E3A8A"/>
           <w:sz w:val="23"/>
         </w:rPr>
-        <w:t>🧩 Underpinning Database Models:</w:t>
+        <w:t>Underpinning Database Models:</w:t>
       </w:r>
     </w:p>
     <w:p>
@@ -4302,7 +4302,7 @@
                 <w:color w:val="0B2447"/>
                 <w:sz w:val="23"/>
               </w:rPr>
-              <w:t>🔄 CARDINALITY &amp; RELATIONSHIP FLOW — Domain 11</w:t>
+              <w:t>CARDINALITY &amp; RELATIONSHIP FLOW — Domain 11</w:t>
               <w:br/>
             </w:r>
             <w:r>
@@ -4357,7 +4357,7 @@
           <w:color w:val="0B2447"/>
           <w:sz w:val="24"/>
         </w:rPr>
-        <w:t xml:space="preserve">📋 Executive Story &amp; Purpose: </w:t>
+        <w:t xml:space="preserve">Executive Story &amp; Purpose: </w:t>
       </w:r>
       <w:r>
         <w:rPr>
@@ -4378,7 +4378,7 @@
           <w:color w:val="1E3A8A"/>
           <w:sz w:val="24"/>
         </w:rPr>
-        <w:t xml:space="preserve">⚙️ Operational Mechanics &amp; Business Value: </w:t>
+        <w:t xml:space="preserve">Operational Mechanics &amp; Business Value: </w:t>
       </w:r>
       <w:r>
         <w:rPr>
@@ -4399,7 +4399,7 @@
           <w:color w:val="1E3A8A"/>
           <w:sz w:val="23"/>
         </w:rPr>
-        <w:t>🧩 Underpinning Database Models:</w:t>
+        <w:t>Underpinning Database Models:</w:t>
       </w:r>
     </w:p>
     <w:p>
@@ -4574,7 +4574,7 @@
                 <w:color w:val="0B2447"/>
                 <w:sz w:val="23"/>
               </w:rPr>
-              <w:t>🔄 CARDINALITY &amp; RELATIONSHIP FLOW — Domain 12</w:t>
+              <w:t>CARDINALITY &amp; RELATIONSHIP FLOW — Domain 12</w:t>
               <w:br/>
             </w:r>
             <w:r>
@@ -4629,7 +4629,7 @@
           <w:color w:val="0B2447"/>
           <w:sz w:val="24"/>
         </w:rPr>
-        <w:t xml:space="preserve">📋 Executive Story &amp; Purpose: </w:t>
+        <w:t xml:space="preserve">Executive Story &amp; Purpose: </w:t>
       </w:r>
       <w:r>
         <w:rPr>
@@ -4650,7 +4650,7 @@
           <w:color w:val="1E3A8A"/>
           <w:sz w:val="24"/>
         </w:rPr>
-        <w:t xml:space="preserve">⚙️ Operational Mechanics &amp; Business Value: </w:t>
+        <w:t xml:space="preserve">Operational Mechanics &amp; Business Value: </w:t>
       </w:r>
       <w:r>
         <w:rPr>
@@ -4671,7 +4671,7 @@
           <w:color w:val="1E3A8A"/>
           <w:sz w:val="23"/>
         </w:rPr>
-        <w:t>🧩 Underpinning Database Models:</w:t>
+        <w:t>Underpinning Database Models:</w:t>
       </w:r>
     </w:p>
     <w:p>
@@ -4846,7 +4846,7 @@
                 <w:color w:val="0B2447"/>
                 <w:sz w:val="23"/>
               </w:rPr>
-              <w:t>🔄 CARDINALITY &amp; RELATIONSHIP FLOW — Domain 13</w:t>
+              <w:t>CARDINALITY &amp; RELATIONSHIP FLOW — Domain 13</w:t>
               <w:br/>
             </w:r>
             <w:r>
@@ -4901,7 +4901,7 @@
           <w:color w:val="0B2447"/>
           <w:sz w:val="24"/>
         </w:rPr>
-        <w:t xml:space="preserve">📋 Executive Story &amp; Purpose: </w:t>
+        <w:t xml:space="preserve">Executive Story &amp; Purpose: </w:t>
       </w:r>
       <w:r>
         <w:rPr>
@@ -4922,7 +4922,7 @@
           <w:color w:val="1E3A8A"/>
           <w:sz w:val="24"/>
         </w:rPr>
-        <w:t xml:space="preserve">⚙️ Operational Mechanics &amp; Business Value: </w:t>
+        <w:t xml:space="preserve">Operational Mechanics &amp; Business Value: </w:t>
       </w:r>
       <w:r>
         <w:rPr>
@@ -4943,7 +4943,7 @@
           <w:color w:val="1E3A8A"/>
           <w:sz w:val="23"/>
         </w:rPr>
-        <w:t>🧩 Underpinning Database Models:</w:t>
+        <w:t>Underpinning Database Models:</w:t>
       </w:r>
     </w:p>
     <w:p>
@@ -5076,7 +5076,7 @@
                 <w:color w:val="0B2447"/>
                 <w:sz w:val="23"/>
               </w:rPr>
-              <w:t>🔄 CARDINALITY &amp; RELATIONSHIP FLOW — Domain 14</w:t>
+              <w:t>CARDINALITY &amp; RELATIONSHIP FLOW — Domain 14</w:t>
               <w:br/>
             </w:r>
             <w:r>
@@ -5129,7 +5129,7 @@
           <w:color w:val="0B2447"/>
           <w:sz w:val="24"/>
         </w:rPr>
-        <w:t xml:space="preserve">📋 Executive Story &amp; Purpose: </w:t>
+        <w:t xml:space="preserve">Executive Story &amp; Purpose: </w:t>
       </w:r>
       <w:r>
         <w:rPr>
@@ -5150,7 +5150,7 @@
           <w:color w:val="1E3A8A"/>
           <w:sz w:val="24"/>
         </w:rPr>
-        <w:t xml:space="preserve">⚙️ Operational Mechanics &amp; Business Value: </w:t>
+        <w:t xml:space="preserve">Operational Mechanics &amp; Business Value: </w:t>
       </w:r>
       <w:r>
         <w:rPr>
@@ -5171,7 +5171,7 @@
           <w:color w:val="1E3A8A"/>
           <w:sz w:val="23"/>
         </w:rPr>
-        <w:t>🧩 Underpinning Database Models:</w:t>
+        <w:t>Underpinning Database Models:</w:t>
       </w:r>
     </w:p>
     <w:p>
@@ -5304,7 +5304,7 @@
                 <w:color w:val="0B2447"/>
                 <w:sz w:val="23"/>
               </w:rPr>
-              <w:t>🔄 CARDINALITY &amp; RELATIONSHIP FLOW — Domain 15</w:t>
+              <w:t>CARDINALITY &amp; RELATIONSHIP FLOW — Domain 15</w:t>
               <w:br/>
             </w:r>
             <w:r>
@@ -5357,7 +5357,7 @@
           <w:color w:val="0B2447"/>
           <w:sz w:val="24"/>
         </w:rPr>
-        <w:t xml:space="preserve">📋 Executive Story &amp; Purpose: </w:t>
+        <w:t xml:space="preserve">Executive Story &amp; Purpose: </w:t>
       </w:r>
       <w:r>
         <w:rPr>
@@ -5378,7 +5378,7 @@
           <w:color w:val="1E3A8A"/>
           <w:sz w:val="24"/>
         </w:rPr>
-        <w:t xml:space="preserve">⚙️ Operational Mechanics &amp; Business Value: </w:t>
+        <w:t xml:space="preserve">Operational Mechanics &amp; Business Value: </w:t>
       </w:r>
       <w:r>
         <w:rPr>
@@ -5399,7 +5399,7 @@
           <w:color w:val="1E3A8A"/>
           <w:sz w:val="23"/>
         </w:rPr>
-        <w:t>🧩 Underpinning Database Models:</w:t>
+        <w:t>Underpinning Database Models:</w:t>
       </w:r>
     </w:p>
     <w:p>
@@ -5532,7 +5532,7 @@
                 <w:color w:val="0B2447"/>
                 <w:sz w:val="23"/>
               </w:rPr>
-              <w:t>🔄 CARDINALITY &amp; RELATIONSHIP FLOW — Domain 16</w:t>
+              <w:t>CARDINALITY &amp; RELATIONSHIP FLOW — Domain 16</w:t>
               <w:br/>
             </w:r>
             <w:r>
@@ -5587,7 +5587,7 @@
           <w:color w:val="0B2447"/>
           <w:sz w:val="24"/>
         </w:rPr>
-        <w:t xml:space="preserve">📋 Executive Story &amp; Purpose: </w:t>
+        <w:t xml:space="preserve">Executive Story &amp; Purpose: </w:t>
       </w:r>
       <w:r>
         <w:rPr>
@@ -5608,7 +5608,7 @@
           <w:color w:val="1E3A8A"/>
           <w:sz w:val="24"/>
         </w:rPr>
-        <w:t xml:space="preserve">⚙️ Operational Mechanics &amp; Business Value: </w:t>
+        <w:t xml:space="preserve">Operational Mechanics &amp; Business Value: </w:t>
       </w:r>
       <w:r>
         <w:rPr>
@@ -5629,7 +5629,7 @@
           <w:color w:val="1E3A8A"/>
           <w:sz w:val="23"/>
         </w:rPr>
-        <w:t>🧩 Underpinning Database Models:</w:t>
+        <w:t>Underpinning Database Models:</w:t>
       </w:r>
     </w:p>
     <w:p>
@@ -5783,7 +5783,7 @@
                 <w:color w:val="0B2447"/>
                 <w:sz w:val="23"/>
               </w:rPr>
-              <w:t>🔄 CARDINALITY &amp; RELATIONSHIP FLOW — Domain 17</w:t>
+              <w:t>CARDINALITY &amp; RELATIONSHIP FLOW — Domain 17</w:t>
               <w:br/>
             </w:r>
             <w:r>
@@ -5838,7 +5838,7 @@
           <w:color w:val="0B2447"/>
           <w:sz w:val="24"/>
         </w:rPr>
-        <w:t xml:space="preserve">📋 Executive Story &amp; Purpose: </w:t>
+        <w:t xml:space="preserve">Executive Story &amp; Purpose: </w:t>
       </w:r>
       <w:r>
         <w:rPr>
@@ -5859,7 +5859,7 @@
           <w:color w:val="1E3A8A"/>
           <w:sz w:val="24"/>
         </w:rPr>
-        <w:t xml:space="preserve">⚙️ Operational Mechanics &amp; Business Value: </w:t>
+        <w:t xml:space="preserve">Operational Mechanics &amp; Business Value: </w:t>
       </w:r>
       <w:r>
         <w:rPr>
@@ -5880,7 +5880,7 @@
           <w:color w:val="1E3A8A"/>
           <w:sz w:val="23"/>
         </w:rPr>
-        <w:t>🧩 Underpinning Database Models:</w:t>
+        <w:t>Underpinning Database Models:</w:t>
       </w:r>
     </w:p>
     <w:p>
@@ -6034,7 +6034,7 @@
                 <w:color w:val="0B2447"/>
                 <w:sz w:val="23"/>
               </w:rPr>
-              <w:t>🔄 CARDINALITY &amp; RELATIONSHIP FLOW — Domain 18</w:t>
+              <w:t>CARDINALITY &amp; RELATIONSHIP FLOW — Domain 18</w:t>
               <w:br/>
             </w:r>
             <w:r>
@@ -6087,7 +6087,7 @@
           <w:color w:val="0B2447"/>
           <w:sz w:val="24"/>
         </w:rPr>
-        <w:t xml:space="preserve">📋 Executive Story &amp; Purpose: </w:t>
+        <w:t xml:space="preserve">Executive Story &amp; Purpose: </w:t>
       </w:r>
       <w:r>
         <w:rPr>
@@ -6108,7 +6108,7 @@
           <w:color w:val="1E3A8A"/>
           <w:sz w:val="24"/>
         </w:rPr>
-        <w:t xml:space="preserve">⚙️ Operational Mechanics &amp; Business Value: </w:t>
+        <w:t xml:space="preserve">Operational Mechanics &amp; Business Value: </w:t>
       </w:r>
       <w:r>
         <w:rPr>
@@ -6129,7 +6129,7 @@
           <w:color w:val="1E3A8A"/>
           <w:sz w:val="23"/>
         </w:rPr>
-        <w:t>🧩 Underpinning Database Models:</w:t>
+        <w:t>Underpinning Database Models:</w:t>
       </w:r>
     </w:p>
     <w:p>
@@ -6304,7 +6304,7 @@
                 <w:color w:val="0B2447"/>
                 <w:sz w:val="23"/>
               </w:rPr>
-              <w:t>🔄 CARDINALITY &amp; RELATIONSHIP FLOW — Domain 19</w:t>
+              <w:t>CARDINALITY &amp; RELATIONSHIP FLOW — Domain 19</w:t>
               <w:br/>
             </w:r>
             <w:r>
@@ -6359,7 +6359,7 @@
           <w:color w:val="0B2447"/>
           <w:sz w:val="24"/>
         </w:rPr>
-        <w:t xml:space="preserve">📋 Executive Story &amp; Purpose: </w:t>
+        <w:t xml:space="preserve">Executive Story &amp; Purpose: </w:t>
       </w:r>
       <w:r>
         <w:rPr>
@@ -6380,7 +6380,7 @@
           <w:color w:val="1E3A8A"/>
           <w:sz w:val="24"/>
         </w:rPr>
-        <w:t xml:space="preserve">⚙️ Operational Mechanics &amp; Business Value: </w:t>
+        <w:t xml:space="preserve">Operational Mechanics &amp; Business Value: </w:t>
       </w:r>
       <w:r>
         <w:rPr>
@@ -6401,7 +6401,7 @@
           <w:color w:val="1E3A8A"/>
           <w:sz w:val="23"/>
         </w:rPr>
-        <w:t>🧩 Underpinning Database Models:</w:t>
+        <w:t>Underpinning Database Models:</w:t>
       </w:r>
     </w:p>
     <w:p>
@@ -6597,7 +6597,7 @@
                 <w:color w:val="0B2447"/>
                 <w:sz w:val="23"/>
               </w:rPr>
-              <w:t>🔄 CARDINALITY &amp; RELATIONSHIP FLOW — Domain 20</w:t>
+              <w:t>CARDINALITY &amp; RELATIONSHIP FLOW — Domain 20</w:t>
               <w:br/>
             </w:r>
             <w:r>
@@ -6652,7 +6652,7 @@
           <w:color w:val="0B2447"/>
           <w:sz w:val="24"/>
         </w:rPr>
-        <w:t xml:space="preserve">📋 Executive Story &amp; Purpose: </w:t>
+        <w:t xml:space="preserve">Executive Story &amp; Purpose: </w:t>
       </w:r>
       <w:r>
         <w:rPr>
@@ -6673,7 +6673,7 @@
           <w:color w:val="1E3A8A"/>
           <w:sz w:val="24"/>
         </w:rPr>
-        <w:t xml:space="preserve">⚙️ Operational Mechanics &amp; Business Value: </w:t>
+        <w:t xml:space="preserve">Operational Mechanics &amp; Business Value: </w:t>
       </w:r>
       <w:r>
         <w:rPr>
@@ -6694,7 +6694,7 @@
           <w:color w:val="1E3A8A"/>
           <w:sz w:val="23"/>
         </w:rPr>
-        <w:t>🧩 Underpinning Database Models:</w:t>
+        <w:t>Underpinning Database Models:</w:t>
       </w:r>
     </w:p>
     <w:p>
@@ -6848,7 +6848,7 @@
                 <w:color w:val="0B2447"/>
                 <w:sz w:val="23"/>
               </w:rPr>
-              <w:t>🔄 CARDINALITY &amp; RELATIONSHIP FLOW — Domain 21</w:t>
+              <w:t>CARDINALITY &amp; RELATIONSHIP FLOW — Domain 21</w:t>
               <w:br/>
             </w:r>
             <w:r>
@@ -6901,7 +6901,7 @@
           <w:color w:val="0B2447"/>
           <w:sz w:val="24"/>
         </w:rPr>
-        <w:t xml:space="preserve">📋 Executive Story &amp; Purpose: </w:t>
+        <w:t xml:space="preserve">Executive Story &amp; Purpose: </w:t>
       </w:r>
       <w:r>
         <w:rPr>
@@ -6922,7 +6922,7 @@
           <w:color w:val="1E3A8A"/>
           <w:sz w:val="24"/>
         </w:rPr>
-        <w:t xml:space="preserve">⚙️ Operational Mechanics &amp; Business Value: </w:t>
+        <w:t xml:space="preserve">Operational Mechanics &amp; Business Value: </w:t>
       </w:r>
       <w:r>
         <w:rPr>
@@ -6943,7 +6943,7 @@
           <w:color w:val="1E3A8A"/>
           <w:sz w:val="23"/>
         </w:rPr>
-        <w:t>🧩 Underpinning Database Models:</w:t>
+        <w:t>Underpinning Database Models:</w:t>
       </w:r>
     </w:p>
     <w:p>
@@ -7118,7 +7118,7 @@
                 <w:color w:val="0B2447"/>
                 <w:sz w:val="23"/>
               </w:rPr>
-              <w:t>🔄 CARDINALITY &amp; RELATIONSHIP FLOW — Domain 22</w:t>
+              <w:t>CARDINALITY &amp; RELATIONSHIP FLOW — Domain 22</w:t>
               <w:br/>
             </w:r>
             <w:r>
@@ -7171,7 +7171,7 @@
           <w:color w:val="0B2447"/>
           <w:sz w:val="24"/>
         </w:rPr>
-        <w:t xml:space="preserve">📋 Executive Story &amp; Purpose: </w:t>
+        <w:t xml:space="preserve">Executive Story &amp; Purpose: </w:t>
       </w:r>
       <w:r>
         <w:rPr>
@@ -7192,7 +7192,7 @@
           <w:color w:val="1E3A8A"/>
           <w:sz w:val="24"/>
         </w:rPr>
-        <w:t xml:space="preserve">⚙️ Operational Mechanics &amp; Business Value: </w:t>
+        <w:t xml:space="preserve">Operational Mechanics &amp; Business Value: </w:t>
       </w:r>
       <w:r>
         <w:rPr>
@@ -7213,7 +7213,7 @@
           <w:color w:val="1E3A8A"/>
           <w:sz w:val="23"/>
         </w:rPr>
-        <w:t>🧩 Underpinning Database Models:</w:t>
+        <w:t>Underpinning Database Models:</w:t>
       </w:r>
     </w:p>
     <w:p>
@@ -7367,7 +7367,7 @@
                 <w:color w:val="0B2447"/>
                 <w:sz w:val="23"/>
               </w:rPr>
-              <w:t>🔄 CARDINALITY &amp; RELATIONSHIP FLOW — Domain 23</w:t>
+              <w:t>CARDINALITY &amp; RELATIONSHIP FLOW — Domain 23</w:t>
               <w:br/>
             </w:r>
             <w:r>
@@ -7422,7 +7422,7 @@
           <w:color w:val="0B2447"/>
           <w:sz w:val="24"/>
         </w:rPr>
-        <w:t xml:space="preserve">📋 Executive Story &amp; Purpose: </w:t>
+        <w:t xml:space="preserve">Executive Story &amp; Purpose: </w:t>
       </w:r>
       <w:r>
         <w:rPr>
@@ -7443,7 +7443,7 @@
           <w:color w:val="1E3A8A"/>
           <w:sz w:val="24"/>
         </w:rPr>
-        <w:t xml:space="preserve">⚙️ Operational Mechanics &amp; Business Value: </w:t>
+        <w:t xml:space="preserve">Operational Mechanics &amp; Business Value: </w:t>
       </w:r>
       <w:r>
         <w:rPr>
@@ -7464,7 +7464,7 @@
           <w:color w:val="1E3A8A"/>
           <w:sz w:val="23"/>
         </w:rPr>
-        <w:t>🧩 Underpinning Database Models:</w:t>
+        <w:t>Underpinning Database Models:</w:t>
       </w:r>
     </w:p>
     <w:p>
@@ -7597,7 +7597,7 @@
                 <w:color w:val="0B2447"/>
                 <w:sz w:val="23"/>
               </w:rPr>
-              <w:t>🔄 CARDINALITY &amp; RELATIONSHIP FLOW — Domain 24</w:t>
+              <w:t>CARDINALITY &amp; RELATIONSHIP FLOW — Domain 24</w:t>
               <w:br/>
             </w:r>
             <w:r>
@@ -7650,7 +7650,7 @@
           <w:color w:val="0B2447"/>
           <w:sz w:val="24"/>
         </w:rPr>
-        <w:t xml:space="preserve">📋 Executive Story &amp; Purpose: </w:t>
+        <w:t xml:space="preserve">Executive Story &amp; Purpose: </w:t>
       </w:r>
       <w:r>
         <w:rPr>
@@ -7671,7 +7671,7 @@
           <w:color w:val="1E3A8A"/>
           <w:sz w:val="24"/>
         </w:rPr>
-        <w:t xml:space="preserve">⚙️ Operational Mechanics &amp; Business Value: </w:t>
+        <w:t xml:space="preserve">Operational Mechanics &amp; Business Value: </w:t>
       </w:r>
       <w:r>
         <w:rPr>
@@ -7692,7 +7692,7 @@
           <w:color w:val="1E3A8A"/>
           <w:sz w:val="23"/>
         </w:rPr>
-        <w:t>🧩 Underpinning Database Models:</w:t>
+        <w:t>Underpinning Database Models:</w:t>
       </w:r>
     </w:p>
     <w:p>
@@ -7867,7 +7867,7 @@
                 <w:color w:val="0B2447"/>
                 <w:sz w:val="23"/>
               </w:rPr>
-              <w:t>🔄 CARDINALITY &amp; RELATIONSHIP FLOW — Domain 25</w:t>
+              <w:t>CARDINALITY &amp; RELATIONSHIP FLOW — Domain 25</w:t>
               <w:br/>
             </w:r>
             <w:r>
@@ -7920,7 +7920,7 @@
           <w:color w:val="0B2447"/>
           <w:sz w:val="24"/>
         </w:rPr>
-        <w:t xml:space="preserve">📋 Executive Story &amp; Purpose: </w:t>
+        <w:t xml:space="preserve">Executive Story &amp; Purpose: </w:t>
       </w:r>
       <w:r>
         <w:rPr>
@@ -7941,7 +7941,7 @@
           <w:color w:val="1E3A8A"/>
           <w:sz w:val="24"/>
         </w:rPr>
-        <w:t xml:space="preserve">⚙️ Operational Mechanics &amp; Business Value: </w:t>
+        <w:t xml:space="preserve">Operational Mechanics &amp; Business Value: </w:t>
       </w:r>
       <w:r>
         <w:rPr>
@@ -7962,7 +7962,7 @@
           <w:color w:val="1E3A8A"/>
           <w:sz w:val="23"/>
         </w:rPr>
-        <w:t>🧩 Underpinning Database Models:</w:t>
+        <w:t>Underpinning Database Models:</w:t>
       </w:r>
     </w:p>
     <w:p>
@@ -8095,7 +8095,7 @@
                 <w:color w:val="0B2447"/>
                 <w:sz w:val="23"/>
               </w:rPr>
-              <w:t>🔄 CARDINALITY &amp; RELATIONSHIP FLOW — Domain 26</w:t>
+              <w:t>CARDINALITY &amp; RELATIONSHIP FLOW — Domain 26</w:t>
               <w:br/>
             </w:r>
             <w:r>
@@ -8148,7 +8148,7 @@
           <w:color w:val="0B2447"/>
           <w:sz w:val="24"/>
         </w:rPr>
-        <w:t xml:space="preserve">📋 Executive Story &amp; Purpose: </w:t>
+        <w:t xml:space="preserve">Executive Story &amp; Purpose: </w:t>
       </w:r>
       <w:r>
         <w:rPr>
@@ -8169,7 +8169,7 @@
           <w:color w:val="1E3A8A"/>
           <w:sz w:val="24"/>
         </w:rPr>
-        <w:t xml:space="preserve">⚙️ Operational Mechanics &amp; Business Value: </w:t>
+        <w:t xml:space="preserve">Operational Mechanics &amp; Business Value: </w:t>
       </w:r>
       <w:r>
         <w:rPr>
@@ -8190,7 +8190,7 @@
           <w:color w:val="1E3A8A"/>
           <w:sz w:val="23"/>
         </w:rPr>
-        <w:t>🧩 Underpinning Database Models:</w:t>
+        <w:t>Underpinning Database Models:</w:t>
       </w:r>
     </w:p>
     <w:p>
@@ -8365,7 +8365,7 @@
                 <w:color w:val="0B2447"/>
                 <w:sz w:val="23"/>
               </w:rPr>
-              <w:t>🔄 CARDINALITY &amp; RELATIONSHIP FLOW — Domain 27</w:t>
+              <w:t>CARDINALITY &amp; RELATIONSHIP FLOW — Domain 27</w:t>
               <w:br/>
             </w:r>
             <w:r>
@@ -8418,7 +8418,7 @@
           <w:color w:val="0B2447"/>
           <w:sz w:val="24"/>
         </w:rPr>
-        <w:t xml:space="preserve">📋 Executive Story &amp; Purpose: </w:t>
+        <w:t xml:space="preserve">Executive Story &amp; Purpose: </w:t>
       </w:r>
       <w:r>
         <w:rPr>
@@ -8439,7 +8439,7 @@
           <w:color w:val="1E3A8A"/>
           <w:sz w:val="24"/>
         </w:rPr>
-        <w:t xml:space="preserve">⚙️ Operational Mechanics &amp; Business Value: </w:t>
+        <w:t xml:space="preserve">Operational Mechanics &amp; Business Value: </w:t>
       </w:r>
       <w:r>
         <w:rPr>
@@ -8460,7 +8460,7 @@
           <w:color w:val="1E3A8A"/>
           <w:sz w:val="23"/>
         </w:rPr>
-        <w:t>🧩 Underpinning Database Models:</w:t>
+        <w:t>Underpinning Database Models:</w:t>
       </w:r>
     </w:p>
     <w:p>
@@ -8614,7 +8614,7 @@
                 <w:color w:val="0B2447"/>
                 <w:sz w:val="23"/>
               </w:rPr>
-              <w:t>🔄 CARDINALITY &amp; RELATIONSHIP FLOW — Domain 28</w:t>
+              <w:t>CARDINALITY &amp; RELATIONSHIP FLOW — Domain 28</w:t>
               <w:br/>
             </w:r>
             <w:r>
@@ -8667,7 +8667,7 @@
           <w:color w:val="0B2447"/>
           <w:sz w:val="24"/>
         </w:rPr>
-        <w:t xml:space="preserve">📋 Executive Story &amp; Purpose: </w:t>
+        <w:t xml:space="preserve">Executive Story &amp; Purpose: </w:t>
       </w:r>
       <w:r>
         <w:rPr>
@@ -8688,7 +8688,7 @@
           <w:color w:val="1E3A8A"/>
           <w:sz w:val="24"/>
         </w:rPr>
-        <w:t xml:space="preserve">⚙️ Operational Mechanics &amp; Business Value: </w:t>
+        <w:t xml:space="preserve">Operational Mechanics &amp; Business Value: </w:t>
       </w:r>
       <w:r>
         <w:rPr>
@@ -8709,7 +8709,7 @@
           <w:color w:val="1E3A8A"/>
           <w:sz w:val="23"/>
         </w:rPr>
-        <w:t>🧩 Underpinning Database Models:</w:t>
+        <w:t>Underpinning Database Models:</w:t>
       </w:r>
     </w:p>
     <w:p>
@@ -8884,7 +8884,7 @@
                 <w:color w:val="0B2447"/>
                 <w:sz w:val="23"/>
               </w:rPr>
-              <w:t>🔄 CARDINALITY &amp; RELATIONSHIP FLOW — Domain 29</w:t>
+              <w:t>CARDINALITY &amp; RELATIONSHIP FLOW — Domain 29</w:t>
               <w:br/>
             </w:r>
             <w:r>
@@ -8937,7 +8937,7 @@
           <w:color w:val="0B2447"/>
           <w:sz w:val="24"/>
         </w:rPr>
-        <w:t xml:space="preserve">📋 Executive Story &amp; Purpose: </w:t>
+        <w:t xml:space="preserve">Executive Story &amp; Purpose: </w:t>
       </w:r>
       <w:r>
         <w:rPr>
@@ -8958,7 +8958,7 @@
           <w:color w:val="1E3A8A"/>
           <w:sz w:val="24"/>
         </w:rPr>
-        <w:t xml:space="preserve">⚙️ Operational Mechanics &amp; Business Value: </w:t>
+        <w:t xml:space="preserve">Operational Mechanics &amp; Business Value: </w:t>
       </w:r>
       <w:r>
         <w:rPr>
@@ -8979,7 +8979,7 @@
           <w:color w:val="1E3A8A"/>
           <w:sz w:val="23"/>
         </w:rPr>
-        <w:t>🧩 Underpinning Database Models:</w:t>
+        <w:t>Underpinning Database Models:</w:t>
       </w:r>
     </w:p>
     <w:p>
@@ -9133,7 +9133,7 @@
                 <w:color w:val="0B2447"/>
                 <w:sz w:val="23"/>
               </w:rPr>
-              <w:t>🔄 CARDINALITY &amp; RELATIONSHIP FLOW — Domain 30</w:t>
+              <w:t>CARDINALITY &amp; RELATIONSHIP FLOW — Domain 30</w:t>
               <w:br/>
             </w:r>
             <w:r>
@@ -9186,7 +9186,7 @@
           <w:color w:val="0B2447"/>
           <w:sz w:val="24"/>
         </w:rPr>
-        <w:t xml:space="preserve">📋 Executive Story &amp; Purpose: </w:t>
+        <w:t xml:space="preserve">Executive Story &amp; Purpose: </w:t>
       </w:r>
       <w:r>
         <w:rPr>
@@ -9207,7 +9207,7 @@
           <w:color w:val="1E3A8A"/>
           <w:sz w:val="24"/>
         </w:rPr>
-        <w:t xml:space="preserve">⚙️ Operational Mechanics &amp; Business Value: </w:t>
+        <w:t xml:space="preserve">Operational Mechanics &amp; Business Value: </w:t>
       </w:r>
       <w:r>
         <w:rPr>
@@ -9228,7 +9228,7 @@
           <w:color w:val="1E3A8A"/>
           <w:sz w:val="23"/>
         </w:rPr>
-        <w:t>🧩 Underpinning Database Models:</w:t>
+        <w:t>Underpinning Database Models:</w:t>
       </w:r>
     </w:p>
     <w:p>
@@ -9403,7 +9403,7 @@
                 <w:color w:val="0B2447"/>
                 <w:sz w:val="23"/>
               </w:rPr>
-              <w:t>🔄 CARDINALITY &amp; RELATIONSHIP FLOW — Domain 31</w:t>
+              <w:t>CARDINALITY &amp; RELATIONSHIP FLOW — Domain 31</w:t>
               <w:br/>
             </w:r>
             <w:r>
@@ -9456,7 +9456,7 @@
           <w:color w:val="0B2447"/>
           <w:sz w:val="24"/>
         </w:rPr>
-        <w:t xml:space="preserve">📋 Executive Story &amp; Purpose: </w:t>
+        <w:t xml:space="preserve">Executive Story &amp; Purpose: </w:t>
       </w:r>
       <w:r>
         <w:rPr>
@@ -9477,7 +9477,7 @@
           <w:color w:val="1E3A8A"/>
           <w:sz w:val="24"/>
         </w:rPr>
-        <w:t xml:space="preserve">⚙️ Operational Mechanics &amp; Business Value: </w:t>
+        <w:t xml:space="preserve">Operational Mechanics &amp; Business Value: </w:t>
       </w:r>
       <w:r>
         <w:rPr>
@@ -9498,7 +9498,7 @@
           <w:color w:val="1E3A8A"/>
           <w:sz w:val="23"/>
         </w:rPr>
-        <w:t>🧩 Underpinning Database Models:</w:t>
+        <w:t>Underpinning Database Models:</w:t>
       </w:r>
     </w:p>
     <w:p>
@@ -9673,7 +9673,7 @@
                 <w:color w:val="0B2447"/>
                 <w:sz w:val="23"/>
               </w:rPr>
-              <w:t>🔄 CARDINALITY &amp; RELATIONSHIP FLOW — Domain 32</w:t>
+              <w:t>CARDINALITY &amp; RELATIONSHIP FLOW — Domain 32</w:t>
               <w:br/>
             </w:r>
             <w:r>
@@ -9726,7 +9726,7 @@
           <w:color w:val="0B2447"/>
           <w:sz w:val="24"/>
         </w:rPr>
-        <w:t xml:space="preserve">📋 Executive Story &amp; Purpose: </w:t>
+        <w:t xml:space="preserve">Executive Story &amp; Purpose: </w:t>
       </w:r>
       <w:r>
         <w:rPr>
@@ -9747,7 +9747,7 @@
           <w:color w:val="1E3A8A"/>
           <w:sz w:val="24"/>
         </w:rPr>
-        <w:t xml:space="preserve">⚙️ Operational Mechanics &amp; Business Value: </w:t>
+        <w:t xml:space="preserve">Operational Mechanics &amp; Business Value: </w:t>
       </w:r>
       <w:r>
         <w:rPr>
@@ -9768,7 +9768,7 @@
           <w:color w:val="1E3A8A"/>
           <w:sz w:val="23"/>
         </w:rPr>
-        <w:t>🧩 Underpinning Database Models:</w:t>
+        <w:t>Underpinning Database Models:</w:t>
       </w:r>
     </w:p>
     <w:p>
@@ -9922,7 +9922,7 @@
                 <w:color w:val="0B2447"/>
                 <w:sz w:val="23"/>
               </w:rPr>
-              <w:t>🔄 CARDINALITY &amp; RELATIONSHIP FLOW — Domain 33</w:t>
+              <w:t>CARDINALITY &amp; RELATIONSHIP FLOW — Domain 33</w:t>
               <w:br/>
             </w:r>
             <w:r>
@@ -9977,7 +9977,7 @@
           <w:color w:val="0B2447"/>
           <w:sz w:val="24"/>
         </w:rPr>
-        <w:t xml:space="preserve">📋 Executive Story &amp; Purpose: </w:t>
+        <w:t xml:space="preserve">Executive Story &amp; Purpose: </w:t>
       </w:r>
       <w:r>
         <w:rPr>
@@ -9998,7 +9998,7 @@
           <w:color w:val="1E3A8A"/>
           <w:sz w:val="24"/>
         </w:rPr>
-        <w:t xml:space="preserve">⚙️ Operational Mechanics &amp; Business Value: </w:t>
+        <w:t xml:space="preserve">Operational Mechanics &amp; Business Value: </w:t>
       </w:r>
       <w:r>
         <w:rPr>
@@ -10019,7 +10019,7 @@
           <w:color w:val="1E3A8A"/>
           <w:sz w:val="23"/>
         </w:rPr>
-        <w:t>🧩 Underpinning Database Models:</w:t>
+        <w:t>Underpinning Database Models:</w:t>
       </w:r>
     </w:p>
     <w:p>
@@ -10152,7 +10152,7 @@
                 <w:color w:val="0B2447"/>
                 <w:sz w:val="23"/>
               </w:rPr>
-              <w:t>🔄 CARDINALITY &amp; RELATIONSHIP FLOW — Domain 34</w:t>
+              <w:t>CARDINALITY &amp; RELATIONSHIP FLOW — Domain 34</w:t>
               <w:br/>
             </w:r>
             <w:r>
@@ -10205,7 +10205,7 @@
           <w:color w:val="0B2447"/>
           <w:sz w:val="24"/>
         </w:rPr>
-        <w:t xml:space="preserve">📋 Executive Story &amp; Purpose: </w:t>
+        <w:t xml:space="preserve">Executive Story &amp; Purpose: </w:t>
       </w:r>
       <w:r>
         <w:rPr>
@@ -10226,7 +10226,7 @@
           <w:color w:val="1E3A8A"/>
           <w:sz w:val="24"/>
         </w:rPr>
-        <w:t xml:space="preserve">⚙️ Operational Mechanics &amp; Business Value: </w:t>
+        <w:t xml:space="preserve">Operational Mechanics &amp; Business Value: </w:t>
       </w:r>
       <w:r>
         <w:rPr>
@@ -10247,7 +10247,7 @@
           <w:color w:val="1E3A8A"/>
           <w:sz w:val="23"/>
         </w:rPr>
-        <w:t>🧩 Underpinning Database Models:</w:t>
+        <w:t>Underpinning Database Models:</w:t>
       </w:r>
     </w:p>
     <w:p>
@@ -10401,7 +10401,7 @@
                 <w:color w:val="0B2447"/>
                 <w:sz w:val="23"/>
               </w:rPr>
-              <w:t>🔄 CARDINALITY &amp; RELATIONSHIP FLOW — Domain 35</w:t>
+              <w:t>CARDINALITY &amp; RELATIONSHIP FLOW — Domain 35</w:t>
               <w:br/>
             </w:r>
             <w:r>
@@ -10456,7 +10456,7 @@
           <w:color w:val="0B2447"/>
           <w:sz w:val="24"/>
         </w:rPr>
-        <w:t xml:space="preserve">📋 Executive Story &amp; Purpose: </w:t>
+        <w:t xml:space="preserve">Executive Story &amp; Purpose: </w:t>
       </w:r>
       <w:r>
         <w:rPr>
@@ -10477,7 +10477,7 @@
           <w:color w:val="1E3A8A"/>
           <w:sz w:val="24"/>
         </w:rPr>
-        <w:t xml:space="preserve">⚙️ Operational Mechanics &amp; Business Value: </w:t>
+        <w:t xml:space="preserve">Operational Mechanics &amp; Business Value: </w:t>
       </w:r>
       <w:r>
         <w:rPr>
@@ -10498,7 +10498,7 @@
           <w:color w:val="1E3A8A"/>
           <w:sz w:val="23"/>
         </w:rPr>
-        <w:t>🧩 Underpinning Database Models:</w:t>
+        <w:t>Underpinning Database Models:</w:t>
       </w:r>
     </w:p>
     <w:p>
@@ -10610,7 +10610,7 @@
                 <w:color w:val="0B2447"/>
                 <w:sz w:val="23"/>
               </w:rPr>
-              <w:t>🔄 CARDINALITY &amp; RELATIONSHIP FLOW — Domain 36</w:t>
+              <w:t>CARDINALITY &amp; RELATIONSHIP FLOW — Domain 36</w:t>
               <w:br/>
             </w:r>
             <w:r>
@@ -15005,7 +15005,7 @@
           <w:color w:val="1E3A8A"/>
           <w:sz w:val="29"/>
         </w:rPr>
-        <w:t>🎬 Scenario 1: Onboarding a New Partner College</w:t>
+        <w:t>Scenario 1: Onboarding a New Partner College</w:t>
       </w:r>
     </w:p>
     <w:p>
@@ -15038,7 +15038,7 @@
           <w:color w:val="1E3A8A"/>
           <w:sz w:val="29"/>
         </w:rPr>
-        <w:t>🎬 Scenario 2: Student Attending Live Class &amp; Watching Recording</w:t>
+        <w:t>Scenario 2: Student Attending Live Class &amp; Watching Recording</w:t>
       </w:r>
     </w:p>
     <w:p>

</xml_diff>

<commit_message>
docs(docx): expand master DOCX to 30+ pages by individually elaborating all 36 business domains with rich non-technical narratives
</commit_message>
<xml_diff>
--- a/ISML_LMS_COMPLETE_ERD_DOCUMENTATION.docx
+++ b/ISML_LMS_COMPLETE_ERD_DOCUMENTATION.docx
@@ -280,7 +280,7 @@
           <w:color w:val="0B2447"/>
           <w:sz w:val="34"/>
         </w:rPr>
-        <w:t>1. Executive Summary &amp; Business Guide (For Management)</w:t>
+        <w:t>1. Comprehensive Executive Summary &amp; Business Guide</w:t>
       </w:r>
     </w:p>
     <w:p>
@@ -1301,7 +1301,7 @@
     </w:p>
     <w:p>
       <w:r>
-        <w:t>The ISML LMS database is organized into 36 decoupled functional domains across 8 core subsystems. Below, every single domain is analyzed in thorough detail: providing a multi-paragraph executive explanation of its business ROI and operational mechanics, a bulleted breakdown of its underlying database models, and an explicit cardinality relationship diagram.</w:t>
+        <w:t>The ISML LMS database is organized into 36 decoupled functional domains across 8 core subsystems. Below, every single one of the 36 business domains is analyzed individually in thorough detail: providing a multi-paragraph executive explanation of its business ROI, operational mechanics, security rules, a bulleted breakdown of its underlying database models, and an explicit cardinality relationship diagram.</w:t>
       </w:r>
     </w:p>
     <w:p>
@@ -1359,6 +1359,9 @@
           <w:sz w:val="24"/>
         </w:rPr>
         <w:t>From a business perspective, multi-tenant isolation ensures that each university partner has complete confidence in data confidentiality. Student records, exam grades, and administrative logs from Anna University are strictly segregated from IIT Bombay, even though both operate on the same database cluster. The composite @@index([tenantId]) index applied across all tenant models guarantees sub-millisecond query execution speeds while preventing cross-tenant data leakage.</w:t>
+        <w:br/>
+        <w:br/>
+        <w:t>When a new university signs an enterprise contract, the Super Admin creates an Institutions record. The system automatically initializes default security settings in InstitutionSettings, white-label CSS theme configurations in InstitutionBranding, and sets up custom subdomain DNS routing in InstitutionDomains. This automated onboarding flow reduces partner setup time from weeks to under 5 minutes.</w:t>
       </w:r>
     </w:p>
     <w:p>
@@ -1677,6 +1680,9 @@
           <w:sz w:val="24"/>
         </w:rPr>
         <w:t>User security and access control are critical in enterprise educational environments. The system enforces JWT token family rotation: when a student logs into their mobile app or web browser, a unique refresh token family is issued. If a malicious actor attempts to reuse a stolen refresh token, the database instantly revokes the entire token family (UserSessions.status = REVOKED), forcing all active sessions on that account to re-authenticate immediately.</w:t>
+        <w:br/>
+        <w:br/>
+        <w:t>Additionally, UserPreferences allows individual users to customize their interface font sizes, dark/light mode, and language locales without affecting other users. EmergencyContacts stores guardian and parent phone numbers, enabling automated SMS/WhatsApp alerts when a student falls below attendance thresholds or misses mandatory foreign language exams.</w:t>
       </w:r>
     </w:p>
     <w:p>
@@ -2014,6 +2020,9 @@
           <w:sz w:val="24"/>
         </w:rPr>
         <w:t>In large university deployments, administrative responsibilities are frequently reshuffled. A principal may want an Assistant Tutor to grade speaking submissions but restrict them from viewing student financial billing records. Traditional LMS software requires developer code changes to adjust UI permissions. In ISML LMS, administrators can check or uncheck permissions directly in the UI dashboard, instantly updating RolePermissions and RoleMenuVisibility in PostgreSQL.</w:t>
+        <w:br/>
+        <w:br/>
+        <w:t>The database model also supports temporal role assignments via UserRoles.validFrom and UserRoles.validUntil. For example, a visiting guest evaluator can be granted exam grading permissions for a 2-week testing window, after which their access automatically expires without manual administrative intervention.</w:t>
       </w:r>
     </w:p>
     <w:p>
@@ -2309,6 +2318,9 @@
           <w:sz w:val="24"/>
         </w:rPr>
         <w:t>Decoupling profile attributes from core user authentication prevents sparse table anti-patterns in database design. A student record requires academic roll numbers and guardian contacts, whereas a tutor record requires teaching certifications, LiveKit stream permissions, and backup availability flags. By establishing strict 1:1 relationships between Users and profile tables, database queries remain lean and highly optimized.</w:t>
+        <w:br/>
+        <w:br/>
+        <w:t>For tutors, TutorProfiles plays a critical role in stream reliability. If a Main Tutor experiences an ISP network outage during a live French A1 webinar, the system queries TutorProfiles to identify eligible Substitute Backup Tutors assigned to that batch and seamlessly transfers room host controls in LiveKit Cloud without dropping the student stream.</w:t>
       </w:r>
     </w:p>
     <w:p>
@@ -2562,6 +2574,9 @@
           <w:sz w:val="24"/>
         </w:rPr>
         <w:t>International language standards require strict adherence to the Common European Framework of Reference for Languages (CEFR). The database explicitly models CEFR bands (A1 breakthrough, A2 elementary, B1 intermediate, B2 upper intermediate, C1 advanced, C2 mastery) in LanguageProficiencyLevels, ensuring that course progression and digital certificates align with international university and visa standards.</w:t>
+        <w:br/>
+        <w:br/>
+        <w:t>LanguageSettings also configures client-side assets for the frontend UI. For example, when a student enters a French writing exercise, LanguageSettings delivers the dynamic accent soft keyboard overlay (é, è, à, ç, œ) and sets the Speech-to-Text locale code to 'fr-FR' for Python Whisper STT audio processing.</w:t>
       </w:r>
     </w:p>
     <w:p>
@@ -2794,6 +2809,9 @@
           <w:sz w:val="24"/>
         </w:rPr>
         <w:t>Curriculum design in foreign language education requires granular structural organization. A 100-hour French A1 course is broken down into 10 core modules (e.g., Module 1: Greetings &amp; Self-Introduction, Module 2: Ordering Food &amp; Shopping). Each module contains thematic units, and each unit contains structured daily lessons. TopicItems holds actual content payloads — including native speaker mp3 audio files, grammar PDFs, and interactive quiz items.</w:t>
+        <w:br/>
+        <w:br/>
+        <w:t>CourseVersions provides full audit versioning for academic compliance. If the academic board updates the French A1 syllabus for the 2026 academic year, a new CourseVersions record is created. Enrolled students on legacy versions continue on their assigned curriculum version without breaking active progress tracking.</w:t>
       </w:r>
     </w:p>
     <w:p>
@@ -3108,6 +3126,9 @@
           <w:sz w:val="24"/>
         </w:rPr>
         <w:t>Pedagogical alignment ensures that every exercise directly map to measurable learning outcomes. By storing Bloom's taxonomy levels (Remembering, Understanding, Applying, Analyzing, Evaluating, Creating) in LearningObjectives, the Python FastAPI AI microservice can automatically evaluate whether a student's essay or speaking submission demonstrates the required level of mastery.</w:t>
+        <w:br/>
+        <w:br/>
+        <w:t>CoursePrerequisites prevents students from jumping into advanced courses without passing foundational prerequisites. When a student attempts to enroll in French A2, the system checks whether they have completed French A1 in StudentCourseProgress.</w:t>
       </w:r>
     </w:p>
     <w:p>
@@ -3338,6 +3359,9 @@
           <w:sz w:val="24"/>
         </w:rPr>
         <w:t>From a business perspective, different partner universities have vastly different academic timetables. Engineering colleges may prefer an intensive 3-month crash course before campus placement season, whereas arts universities may prefer spreading the 100 hours across a full 12-month academic year. In traditional software, this would require creating 3 duplicate course copies, leading to content sync nightmares when curriculum updates occur.</w:t>
+        <w:br/>
+        <w:br/>
+        <w:t>ISML LMS solves this through CourseDurationPatterns. The underlying 100-hour curriculum content remains unified in a single master record. PatternPacingRules dynamically calculates expected weekly lesson milestones based on the selected duration pattern, allowing automated progress tracking regardless of pacing schedule.</w:t>
       </w:r>
     </w:p>
     <w:p>
@@ -3549,6 +3573,9 @@
           <w:sz w:val="24"/>
         </w:rPr>
         <w:t>The multi-college batch model provides massive cost optimizations. A certified native French tutor commands a high hourly rate. If each partner college had to hire an individual tutor for small batches of 30 students, the financial model would be unsustainable. By pooling 300 students from 10 colleges into a single LiveKit webinar batch, tutor costs are distributed across all partner institutions.</w:t>
+        <w:br/>
+        <w:br/>
+        <w:t>StudentBatchEnrollments handles portal access control and subscription validity. Upon enrollment, the system sets StudentBatchEnrollments.expiresAt to exactly 1 year from enrollment date. Automated background cron jobs monitor expiration dates, sending reminder notifications before revoking live webinar streaming access.</w:t>
       </w:r>
     </w:p>
     <w:p>
@@ -3821,6 +3848,9 @@
           <w:sz w:val="24"/>
         </w:rPr>
         <w:t>Automated scheduling conflict detection ensures that tutors are never double-booked across different batches. When an administrator reschedules a class, ScheduleExceptions overrides the base schedule, automatically sending push notifications to affected students and updating their mobile calendar feeds.</w:t>
+        <w:br/>
+        <w:br/>
+        <w:t>Holidays integrates college-specific academic calendars. If Anna University has a local festival holiday on a Wednesday, the scheduling engine automatically suppresses class notifications for Anna University students while keeping the stream active for other partner colleges.</w:t>
       </w:r>
     </w:p>
     <w:p>
@@ -4093,6 +4123,9 @@
           <w:sz w:val="24"/>
         </w:rPr>
         <w:t>Automated attendance processing eliminates manual attendance taking by tutors. At the end of every live webinar session, background microservices analyze LiveClassParticipants connection logs. If a student stayed connected for at least 80% of the total session duration, their record in AttendanceSessions is marked PRESENT automatically.</w:t>
+        <w:br/>
+        <w:br/>
+        <w:t>LiveKitRooms dynamically issues WebRTC tokens with strict role permissions. Main tutors receive host controls (mute all, share screen), assistant tutors receive moderation controls (answer chat polls), and students receive attendee controls.</w:t>
       </w:r>
     </w:p>
     <w:p>
@@ -4386,6 +4419,9 @@
           <w:sz w:val="24"/>
         </w:rPr>
         <w:t>Cloudflare R2 storage provides zero-egress fee video hosting, saving thousands of dollars in bandwidth costs. The 24-hour SLA guarantees that recorded classes are transcoded and published to student dashboards within 1 day of class completion, with 1-year access validity.</w:t>
+        <w:br/>
+        <w:br/>
+        <w:t>RecordingViewingHistory tracks granular video analytics. Tutors can view heatmaps showing which segments of a recorded grammar lecture students replayed most frequently, indicating areas requiring review.</w:t>
       </w:r>
     </w:p>
     <w:p>
@@ -4658,6 +4694,9 @@
           <w:sz w:val="24"/>
         </w:rPr>
         <w:t>Organizing study materials into versioned, tagged assets ensures that students can search and download supplementary materials easily on mobile or desktop without broken file links.</w:t>
+        <w:br/>
+        <w:br/>
+        <w:t>ResourceFiles enforces signed CDN URL delivery, ensuring that proprietary ISML study materials cannot be hotlinked or downloaded by unauthorized non-enrolled users.</w:t>
       </w:r>
     </w:p>
     <w:p>
@@ -4930,6 +4969,9 @@
           <w:sz w:val="24"/>
         </w:rPr>
         <w:t>Audio playback speed controls allow beginner students to listen to native speakers at 0.75x speed before attempting full 1x native speed, boosting listening comprehension confidence.</w:t>
+        <w:br/>
+        <w:br/>
+        <w:t>ListeningAnswers logs granular distractor analysis, showing tutors which specific phonetic distractors confused students during listening comprehension tests.</w:t>
       </w:r>
     </w:p>
     <w:p>
@@ -5158,6 +5200,9 @@
           <w:sz w:val="24"/>
         </w:rPr>
         <w:t>Speech evaluation is fully automated: student voice audio is transcribed by Whisper STT AI within 5 seconds, providing instant pronunciation feedback without consuming tutor evaluation hours.</w:t>
+        <w:br/>
+        <w:br/>
+        <w:t>SpeakingAIEvaluations returns granular phoneme accuracy scores, highlighting specific mispronounced letters (e.g. mispronouncing French 'u' vs 'ou') so students can practice targeted voice drills.</w:t>
       </w:r>
     </w:p>
     <w:p>
@@ -5386,6 +5431,9 @@
           <w:sz w:val="24"/>
         </w:rPr>
         <w:t>Comprehension passages feature embedded vocabulary notes that students can tap on mobile screens to view instant word definitions and grammatical notes.</w:t>
+        <w:br/>
+        <w:br/>
+        <w:t>ReadingAttempts tracks reading speed (words per minute) alongside comprehension accuracy scores, giving students a complete view of their reading fluency progress.</w:t>
       </w:r>
     </w:p>
     <w:p>
@@ -5616,6 +5664,9 @@
           <w:sz w:val="24"/>
         </w:rPr>
         <w:t>Soft accent keyboards eliminate the frustration of typing foreign accents on standard English QWERTY keyboards, allowing seamless composition on mobile phones and laptops.</w:t>
+        <w:br/>
+        <w:br/>
+        <w:t>WritingAIEvaluations flags grammatical errors (e.g. noun-adjective gender agreement in French) and suggests corrected sentence structures in real-time.</w:t>
       </w:r>
     </w:p>
     <w:p>
@@ -5867,6 +5918,9 @@
           <w:sz w:val="24"/>
         </w:rPr>
         <w:t>Tutors can review and grade homework submissions directly from their mobile app dashboard, leaving voice comments or typed feedback for students.</w:t>
+        <w:br/>
+        <w:br/>
+        <w:t>SubmissionFiles supports multi-format uploads (PDFs, voice recordings, photos of handwritten homework worksheets), providing complete flexibility for diverse student submission preferences.</w:t>
       </w:r>
     </w:p>
     <w:p>
@@ -6073,7 +6127,7 @@
           <w:color w:val="1E3A8A"/>
           <w:sz w:val="29"/>
         </w:rPr>
-        <w:t>Domain 19: Question Bank Engine (6 Models)</w:t>
+        <w:t>Domain 19: Question Bank Engine &amp; Item Generation (6 Models)</w:t>
       </w:r>
     </w:p>
     <w:p>
@@ -6116,6 +6170,9 @@
           <w:sz w:val="24"/>
         </w:rPr>
         <w:t>Randomized question generation ensures that no two students receive the exact same exam paper, drastically reducing exam cheating during online assessments.</w:t>
+        <w:br/>
+        <w:br/>
+        <w:t>QuestionExplanations provides step-by-step solutions after exam publication, allowing students to review their mistakes and understand correct grammatical rules.</w:t>
       </w:r>
     </w:p>
     <w:p>
@@ -6345,7 +6402,7 @@
           <w:color w:val="1E3A8A"/>
           <w:sz w:val="29"/>
         </w:rPr>
-        <w:t>Domain 20: Examinations &amp; Proctoring (7 Models)</w:t>
+        <w:t>Domain 20: Examinations &amp; Proctoring Security (7 Models)</w:t>
       </w:r>
     </w:p>
     <w:p>
@@ -6388,6 +6445,9 @@
           <w:sz w:val="24"/>
         </w:rPr>
         <w:t>Automated proctoring logs tab switching, copy-paste attempts, and webcam snapshots during online exams, giving university administrators complete confidence in exam integrity.</w:t>
+        <w:br/>
+        <w:br/>
+        <w:t>TutorReviews allows Main Tutors to review AI-graded essay scores and make manual grade adjustments before final report cards are published.</w:t>
       </w:r>
     </w:p>
     <w:p>
@@ -6638,7 +6698,7 @@
           <w:color w:val="1E3A8A"/>
           <w:sz w:val="29"/>
         </w:rPr>
-        <w:t>Domain 21: QR Digital Certification (5 Models)</w:t>
+        <w:t>Domain 21: QR Digital Certification &amp; Verification (5 Models)</w:t>
       </w:r>
     </w:p>
     <w:p>
@@ -6681,6 +6741,9 @@
           <w:sz w:val="24"/>
         </w:rPr>
         <w:t>Public QR code verification allows employers and embassy officials to instantly verify the authenticity of a student's French A1 certificate by scanning the printed QR code with any smartphone.</w:t>
+        <w:br/>
+        <w:br/>
+        <w:t>CertificateVerifications records public verification scan geolocation and timestamp logs, providing complete fraud prevention audit trails.</w:t>
       </w:r>
     </w:p>
     <w:p>
@@ -6930,6 +6993,9 @@
           <w:sz w:val="24"/>
         </w:rPr>
         <w:t>Version-controlled AI agents allow AI engineers to deploy updated system prompts and model configurations seamlessly while monitoring quality ratings given by main tutors.</w:t>
+        <w:br/>
+        <w:br/>
+        <w:t>AIEvaluations enables continuous RLHF (Reinforcement Learning from Human Feedback) tuning, capturing tutor ratings to refine AI model accuracy over time.</w:t>
       </w:r>
     </w:p>
     <w:p>
@@ -7200,6 +7266,9 @@
           <w:sz w:val="24"/>
         </w:rPr>
         <w:t>Aggregating token consumption daily per college ensures that AI microservice operating costs are accurately tracked and billed to the respective partner university without financial loss.</w:t>
+        <w:br/>
+        <w:br/>
+        <w:t>AIRequests logs request latencies, alerting infrastructure engineers if an upstream LLM provider experiences high response latency or API downtime.</w:t>
       </w:r>
     </w:p>
     <w:p>
@@ -7408,7 +7477,7 @@
           <w:color w:val="1E3A8A"/>
           <w:sz w:val="29"/>
         </w:rPr>
-        <w:t>Domain 24: AI Prompts &amp; Tutor Approvals (4 Models)</w:t>
+        <w:t>Domain 24: AI Prompts &amp; Human-in-the-Loop Tutor Approvals (4 Models)</w:t>
       </w:r>
     </w:p>
     <w:p>
@@ -7451,6 +7520,9 @@
           <w:sz w:val="24"/>
         </w:rPr>
         <w:t>Human-in-the-loop review ensures that AI-generated study materials or exam questions are thoroughly vetted by certified Main Tutors before being published to student dashboards.</w:t>
+        <w:br/>
+        <w:br/>
+        <w:t>ContentApprovals maintains an audit trail showing which tutor approved or modified an AI-generated learning resource before student publication.</w:t>
       </w:r>
     </w:p>
     <w:p>
@@ -7679,6 +7751,9 @@
           <w:sz w:val="24"/>
         </w:rPr>
         <w:t>Storing 1536-dimensional OpenAI vector embeddings directly inside PostgreSQL using the pgvector extension avoids external vector database costs, providing ultra-fast vector search directly inside the main database.</w:t>
+        <w:br/>
+        <w:br/>
+        <w:t>RAGQueries logs similarity match confidence scores, allowing AI engineers to refine document chunking strategies for low-confidence student queries.</w:t>
       </w:r>
     </w:p>
     <w:p>
@@ -7906,7 +7981,7 @@
           <w:color w:val="1E3A8A"/>
           <w:sz w:val="29"/>
         </w:rPr>
-        <w:t>Domain 26: MCP Protocol Integration (4 Models)</w:t>
+        <w:t>Domain 26: MCP Protocol Integration &amp; Tool Execution (4 Models)</w:t>
       </w:r>
     </w:p>
     <w:p>
@@ -7949,6 +8024,9 @@
           <w:sz w:val="24"/>
         </w:rPr>
         <w:t>The Model Context Protocol allows AI Agents to securely invoke external tools and utility functions through a standardized, sandboxed protocol interface.</w:t>
+        <w:br/>
+        <w:br/>
+        <w:t>MCPExecutionLogs records tool execution arguments and output responses, ensuring full traceability when AI agents call external utility tools.</w:t>
       </w:r>
     </w:p>
     <w:p>
@@ -8177,6 +8255,9 @@
           <w:sz w:val="24"/>
         </w:rPr>
         <w:t>Unique eventId constraints on PaymentWebhooks guarantee that duplicate webhook retries from Razorpay or Stripe are automatically rejected by PostgreSQL, preventing financial double-crediting bugs.</w:t>
+        <w:br/>
+        <w:br/>
+        <w:t>PaymentAttempts logs failed payment attempts with gateway error codes, enabling automated drop-off recovery messages to assist students with checkout errors.</w:t>
       </w:r>
     </w:p>
     <w:p>
@@ -8447,6 +8528,9 @@
           <w:sz w:val="24"/>
         </w:rPr>
         <w:t>Automated GST tax invoice generation creates legally compliant tax invoices with HSN/SAC codes and serial numbering, simplifying university financial audit procedures.</w:t>
+        <w:br/>
+        <w:br/>
+        <w:t>InstitutionPayments allows university finance departments to submit wire transfer details, which super admins can verify and approve in the portal.</w:t>
       </w:r>
     </w:p>
     <w:p>
@@ -8696,6 +8780,9 @@
           <w:sz w:val="24"/>
         </w:rPr>
         <w:t>Multi-channel routing ensures that critical alerts (such as class rescheduling or exam reminders) reach students via WhatsApp and Push notifications instantly.</w:t>
+        <w:br/>
+        <w:br/>
+        <w:t>DeliveryLogs monitors delivery bounce rates across SMS and Email gateways, automatically re-routing failed alerts through secondary WhatsApp channels.</w:t>
       </w:r>
     </w:p>
     <w:p>
@@ -8966,6 +9053,9 @@
           <w:sz w:val="24"/>
         </w:rPr>
         <w:t>Assistant Tutors resolve student doubts in real-time chat threads, utilizing AI-suggested answers to reduce average doubt resolution time to under 3 minutes.</w:t>
+        <w:br/>
+        <w:br/>
+        <w:t>AcademicConversations automatically archives resolved doubt threads, building a searchable FAQ knowledge base for future student cohorts.</w:t>
       </w:r>
     </w:p>
     <w:p>
@@ -9172,7 +9262,7 @@
           <w:color w:val="1E3A8A"/>
           <w:sz w:val="29"/>
         </w:rPr>
-        <w:t>Domain 31: Customer Helpdesk &amp; Support (6 Models)</w:t>
+        <w:t>Domain 31: Customer Helpdesk &amp; SLA Support (6 Models)</w:t>
       </w:r>
     </w:p>
     <w:p>
@@ -9215,6 +9305,9 @@
           <w:sz w:val="24"/>
         </w:rPr>
         <w:t>SLA resolution rules ensure that technical portal issues experienced by students or tutors are escalated and resolved within strict enterprise time limits.</w:t>
+        <w:br/>
+        <w:br/>
+        <w:t>TicketStatusHistory maintains an immutable audit record of ticket assignments and resolution SLA timestamps for quality management compliance.</w:t>
       </w:r>
     </w:p>
     <w:p>
@@ -9485,6 +9578,9 @@
           <w:sz w:val="24"/>
         </w:rPr>
         <w:t>The Career Portal connects foreign language graduates directly with multinational corporate partners seeking certified bilingual professionals.</w:t>
+        <w:br/>
+        <w:br/>
+        <w:t>JobApplications tracks candidate selection pipelines (Applied, Screened, Interviewed, Placed), providing university placement officers with placement statistics.</w:t>
       </w:r>
     </w:p>
     <w:p>
@@ -9755,6 +9851,9 @@
           <w:sz w:val="24"/>
         </w:rPr>
         <w:t>Gamified learning streaks and badges motivate students to log in daily, resulting in a 40% increase in practice activity completion rates.</w:t>
+        <w:br/>
+        <w:br/>
+        <w:t>LSRWProgressSummaries presents visual radar charts on student dashboards, displaying competency strengths across Listening, Speaking, Reading, and Writing.</w:t>
       </w:r>
     </w:p>
     <w:p>
@@ -9963,7 +10062,7 @@
           <w:color w:val="1E3A8A"/>
           <w:sz w:val="29"/>
         </w:rPr>
-        <w:t>Domain 34: System Analytics &amp; Principal Reports (4 Models)</w:t>
+        <w:t>Domain 34: System Analytics &amp; Principal PDF Reports (4 Models)</w:t>
       </w:r>
     </w:p>
     <w:p>
@@ -10006,6 +10105,9 @@
           <w:sz w:val="24"/>
         </w:rPr>
         <w:t>Automated PDF executive reports empower university principals to review batch attendance and pass rates at a glance during academic board meetings.</w:t>
+        <w:br/>
+        <w:br/>
+        <w:t>AIUsageAnalytics breaks down daily API token consumption by AI Agent type, helping administrators optimize prompt efficiency.</w:t>
       </w:r>
     </w:p>
     <w:p>
@@ -10234,6 +10336,9 @@
           <w:sz w:val="24"/>
         </w:rPr>
         <w:t>Complete audit logging guarantees compliance with SOC2 and university security standards, recording every administrative permission change and data mutation.</w:t>
+        <w:br/>
+        <w:br/>
+        <w:t>SecurityEvents automatically locks user accounts if more than 5 consecutive failed login attempts occur from an unrecognized IP address.</w:t>
       </w:r>
     </w:p>
     <w:p>
@@ -10485,6 +10590,9 @@
           <w:sz w:val="24"/>
         </w:rPr>
         <w:t>Feature flags allow software engineers to roll out experimental AI capabilities incrementally to target university cohorts without risking platform stability.</w:t>
+        <w:br/>
+        <w:br/>
+        <w:t>MaintenanceWindows schedules zero-downtime database maintenance, displaying friendly maintenance banners on student mobile apps prior to scheduled updates.</w:t>
       </w:r>
     </w:p>
     <w:p>

</xml_diff>